<commit_message>
chore(resume): update contact email to shruti.sharma6386@gmail.com and rebuild PDF/DOCX
</commit_message>
<xml_diff>
--- a/Aman-Sharma-Resume.docx
+++ b/Aman-Sharma-Resume.docx
@@ -149,7 +149,7 @@
             </w:r>
             <w:hyperlink r:id="rId11">
               <w:r>
-                <w:t>codewithaman88@gmail.com</w:t>
+                <w:t>shruti.sharma6386@gmail.com</w:t>
                 <w:rPr>
                   <w:rFonts w:ascii="Calibri" w:hAnsi="Calibri"/>
                   <w:sz w:val="14"/>
@@ -2280,7 +2280,7 @@
                 <w:color w:val="737373"/>
                 <w:sz w:val="12"/>
               </w:rPr>
-              <w:t>Contact: +91-9690683156  •  codewithaman88@gmail.com</w:t>
+              <w:t>Contact: +91-9690683156  •  shruti.sharma6386@gmail.com</w:t>
             </w:r>
           </w:p>
         </w:tc>

</xml_diff>